<commit_message>
feat: add topics step to navigation flow and integrate topic selection
</commit_message>
<xml_diff>
--- a/CS-Fundamentals-A/CS-Fundamentals-A.docx
+++ b/CS-Fundamentals-A/CS-Fundamentals-A.docx
@@ -324,7 +324,21 @@
         <w:rPr>
           <w:rtl/>
         </w:rPr>
-        <w:t xml:space="preserve"> — מסך השאלון הפעיל (הצגת שאלה, טאב קוד ב-</w:t>
+        <w:t xml:space="preserve"> — מסך השאלון הפעיל (הצגת שאלה, </w:t>
+      </w:r>
+      <w:proofErr w:type="spellStart"/>
+      <w:r>
+        <w:rPr>
+          <w:rtl/>
+        </w:rPr>
+        <w:t>טאב</w:t>
+      </w:r>
+      <w:proofErr w:type="spellEnd"/>
+      <w:r>
+        <w:rPr>
+          <w:rtl/>
+        </w:rPr>
+        <w:t xml:space="preserve"> קוד ב-</w:t>
       </w:r>
       <w:r>
         <w:t>C</w:t>
@@ -353,7 +367,21 @@
         <w:rPr>
           <w:rtl/>
         </w:rPr>
-        <w:t xml:space="preserve"> — מסך תוצאות וסיכום (חישוב ציון אחוזוני, שליחה ל-</w:t>
+        <w:t xml:space="preserve"> — מסך תוצאות וסיכום (חישוב ציון </w:t>
+      </w:r>
+      <w:proofErr w:type="spellStart"/>
+      <w:r>
+        <w:rPr>
+          <w:rtl/>
+        </w:rPr>
+        <w:t>אחוזוני</w:t>
+      </w:r>
+      <w:proofErr w:type="spellEnd"/>
+      <w:r>
+        <w:rPr>
+          <w:rtl/>
+        </w:rPr>
+        <w:t>, שליחה ל-</w:t>
       </w:r>
       <w:r>
         <w:t>Google Sheets</w:t>
@@ -808,9 +836,19 @@
         </w:rPr>
         <w:t>שמירת הישגים והתקדמות לכל נושא בנפרד (</w:t>
       </w:r>
-      <w:r>
-        <w:t>LocalStorage / SessionStorage</w:t>
-      </w:r>
+      <w:proofErr w:type="spellStart"/>
+      <w:r>
+        <w:t>LocalStorage</w:t>
+      </w:r>
+      <w:proofErr w:type="spellEnd"/>
+      <w:r>
+        <w:t xml:space="preserve"> / </w:t>
+      </w:r>
+      <w:proofErr w:type="spellStart"/>
+      <w:r>
+        <w:t>SessionStorage</w:t>
+      </w:r>
+      <w:proofErr w:type="spellEnd"/>
       <w:r>
         <w:rPr>
           <w:rtl/>
@@ -1259,18 +1297,22 @@
         </w:rPr>
         <w:t># (</w:t>
       </w:r>
+      <w:proofErr w:type="spellStart"/>
       <w:r>
         <w:t>allIOVQuestions</w:t>
       </w:r>
+      <w:proofErr w:type="spellEnd"/>
       <w:r>
         <w:rPr>
           <w:rtl/>
         </w:rPr>
         <w:t xml:space="preserve"> ו־</w:t>
       </w:r>
+      <w:proofErr w:type="spellStart"/>
       <w:r>
         <w:t>expertIOVQuestions</w:t>
       </w:r>
+      <w:proofErr w:type="spellEnd"/>
       <w:r>
         <w:rPr>
           <w:rtl/>
@@ -1364,7 +1406,21 @@
         <w:rPr>
           <w:rtl/>
         </w:rPr>
-        <w:t xml:space="preserve">#, סרגל התקדמות, אפשרות לבדיקת תשובה וקבלת משוב והסבר מיידי. </w:t>
+        <w:t xml:space="preserve">#, סרגל התקדמות, אפשרות לבדיקת תשובה וקבלת משוב והסבר </w:t>
+      </w:r>
+      <w:proofErr w:type="spellStart"/>
+      <w:r>
+        <w:rPr>
+          <w:rtl/>
+        </w:rPr>
+        <w:t>מיידי</w:t>
+      </w:r>
+      <w:proofErr w:type="spellEnd"/>
+      <w:r>
+        <w:rPr>
+          <w:rtl/>
+        </w:rPr>
+        <w:t xml:space="preserve">. </w:t>
       </w:r>
     </w:p>
     <w:p>
@@ -1406,9 +1462,11 @@
         </w:rPr>
         <w:t>: לוח בקרה למורה המאפשר נעילה ופתיחה של נושאי סילבוס באמצעות סיסמת ניהול ושמירה ב־</w:t>
       </w:r>
+      <w:proofErr w:type="spellStart"/>
       <w:r>
         <w:t>localStorage</w:t>
       </w:r>
+      <w:proofErr w:type="spellEnd"/>
       <w:r>
         <w:rPr>
           <w:rtl/>
@@ -1717,9 +1775,11 @@
         </w:rPr>
         <w:t>כרגע המערכת טוענת את מאגר השאלות של קלט/פלט (</w:t>
       </w:r>
+      <w:proofErr w:type="spellStart"/>
       <w:r>
         <w:t>allIOVQuestions</w:t>
       </w:r>
+      <w:proofErr w:type="spellEnd"/>
       <w:r>
         <w:rPr>
           <w:rtl/>
@@ -1766,8 +1826,20 @@
           <w:rtl/>
         </w:rPr>
         <w:lastRenderedPageBreak/>
-        <w:t>אני עייפה לקרוא.האם</w:t>
-      </w:r>
+        <w:t xml:space="preserve">אני עייפה </w:t>
+      </w:r>
+      <w:proofErr w:type="spellStart"/>
+      <w:r>
+        <w:rPr>
+          <w:rFonts w:ascii="Google Sans" w:hAnsi="Google Sans"/>
+          <w:color w:val="E3E3E3"/>
+          <w:sz w:val="26"/>
+          <w:szCs w:val="26"/>
+          <w:rtl/>
+        </w:rPr>
+        <w:t>לקרוא.האם</w:t>
+      </w:r>
+      <w:proofErr w:type="spellEnd"/>
       <w:r>
         <w:rPr>
           <w:rFonts w:ascii="Google Sans" w:hAnsi="Google Sans"/>
@@ -2081,9 +2153,6 @@
           <w:ilvl w:val="0"/>
           <w:numId w:val="5"/>
         </w:numPr>
-        <w:rPr>
-          <w:rtl/>
-        </w:rPr>
       </w:pPr>
       <w:r>
         <w:rPr>
@@ -2103,7 +2172,1303 @@
     </w:p>
     <w:p>
       <w:pPr>
-        <w:ind w:firstLine="720"/>
+        <w:rPr>
+          <w:rFonts w:asciiTheme="minorBidi" w:hAnsiTheme="minorBidi"/>
+          <w:b/>
+          <w:bCs/>
+          <w:color w:val="EE0000"/>
+          <w:rtl/>
+        </w:rPr>
+      </w:pPr>
+      <w:r>
+        <w:rPr>
+          <w:rFonts w:asciiTheme="minorBidi" w:hAnsiTheme="minorBidi" w:hint="cs"/>
+          <w:b/>
+          <w:bCs/>
+          <w:color w:val="EE0000"/>
+          <w:rtl/>
+        </w:rPr>
+        <w:t>???</w:t>
+      </w:r>
+    </w:p>
+    <w:p>
+      <w:pPr>
+        <w:rPr>
+          <w:bCs/>
+        </w:rPr>
+      </w:pPr>
+      <w:r>
+        <w:rPr>
+          <w:bCs/>
+          <w:rtl/>
+        </w:rPr>
+        <w:t>בסיכום המסמך של הפרויקט</w:t>
+      </w:r>
+      <w:r>
+        <w:rPr>
+          <w:bCs/>
+        </w:rPr>
+        <w:t xml:space="preserve"> (CS-Fundamentals-A.docx), </w:t>
+      </w:r>
+      <w:r>
+        <w:rPr>
+          <w:bCs/>
+          <w:rtl/>
+        </w:rPr>
+        <w:t>קובץ התיעוד הנדרש כולל בתוכו</w:t>
+      </w:r>
+      <w:r>
+        <w:rPr>
+          <w:bCs/>
+        </w:rPr>
+        <w:t xml:space="preserve">: </w:t>
+      </w:r>
+    </w:p>
+    <w:p>
+      <w:pPr>
+        <w:numPr>
+          <w:ilvl w:val="0"/>
+          <w:numId w:val="6"/>
+        </w:numPr>
+      </w:pPr>
+      <w:r>
+        <w:rPr>
+          <w:b/>
+          <w:bCs/>
+          <w:rtl/>
+        </w:rPr>
+        <w:t>תיאור כללי של האפליקציה</w:t>
+      </w:r>
+      <w:r>
+        <w:rPr>
+          <w:b/>
+          <w:bCs/>
+        </w:rPr>
+        <w:t xml:space="preserve"> (Overview):</w:t>
+      </w:r>
+      <w:r>
+        <w:t xml:space="preserve"> </w:t>
+      </w:r>
+      <w:r>
+        <w:rPr>
+          <w:rtl/>
+        </w:rPr>
+        <w:t>אפליקציית תרגול ב</w:t>
+      </w:r>
+      <w:r>
+        <w:t xml:space="preserve">-React </w:t>
+      </w:r>
+      <w:r>
+        <w:rPr>
+          <w:rtl/>
+        </w:rPr>
+        <w:t>ו</w:t>
+      </w:r>
+      <w:r>
+        <w:t xml:space="preserve">-Tailwind </w:t>
+      </w:r>
+      <w:r>
+        <w:rPr>
+          <w:rtl/>
+        </w:rPr>
+        <w:t>ללימוד</w:t>
+      </w:r>
+      <w:r>
+        <w:t xml:space="preserve"> C# </w:t>
+      </w:r>
+      <w:r>
+        <w:rPr>
+          <w:rtl/>
+        </w:rPr>
+        <w:t>עם לוח בקרה למורה</w:t>
+      </w:r>
+      <w:r>
+        <w:t xml:space="preserve">. </w:t>
+      </w:r>
+    </w:p>
+    <w:p>
+      <w:pPr>
+        <w:numPr>
+          <w:ilvl w:val="0"/>
+          <w:numId w:val="6"/>
+        </w:numPr>
+      </w:pPr>
+      <w:r>
+        <w:rPr>
+          <w:b/>
+          <w:bCs/>
+          <w:rtl/>
+        </w:rPr>
+        <w:t>מבנה התיקיות והקבצים</w:t>
+      </w:r>
+      <w:r>
+        <w:rPr>
+          <w:b/>
+          <w:bCs/>
+        </w:rPr>
+        <w:t xml:space="preserve"> (Directory Structure):</w:t>
+      </w:r>
+      <w:r>
+        <w:t xml:space="preserve"> </w:t>
+      </w:r>
+      <w:r>
+        <w:rPr>
+          <w:rtl/>
+        </w:rPr>
+        <w:t xml:space="preserve">פירוט התיקיות </w:t>
+      </w:r>
+      <w:r>
+        <w:t xml:space="preserve">screens/, content/, </w:t>
+      </w:r>
+      <w:r>
+        <w:rPr>
+          <w:rtl/>
+        </w:rPr>
+        <w:t>קבצי ההגדרות והראשיים</w:t>
+      </w:r>
+      <w:r>
+        <w:t xml:space="preserve">. </w:t>
+      </w:r>
+    </w:p>
+    <w:p>
+      <w:pPr>
+        <w:numPr>
+          <w:ilvl w:val="0"/>
+          <w:numId w:val="6"/>
+        </w:numPr>
+      </w:pPr>
+      <w:r>
+        <w:rPr>
+          <w:b/>
+          <w:bCs/>
+          <w:rtl/>
+        </w:rPr>
+        <w:t>רשימת נושאי הסילבוס</w:t>
+      </w:r>
+      <w:r>
+        <w:rPr>
+          <w:b/>
+          <w:bCs/>
+        </w:rPr>
+        <w:t xml:space="preserve"> (Syllabus):</w:t>
+      </w:r>
+      <w:r>
+        <w:t xml:space="preserve"> 10 </w:t>
+      </w:r>
+      <w:r>
+        <w:rPr>
+          <w:rtl/>
+        </w:rPr>
+        <w:t>הנושאים של יסודות א' (ממשתנים וקלט/פלט עד מערכים)</w:t>
+      </w:r>
+      <w:r>
+        <w:t xml:space="preserve">. </w:t>
+      </w:r>
+    </w:p>
+    <w:p>
+      <w:pPr>
+        <w:numPr>
+          <w:ilvl w:val="0"/>
+          <w:numId w:val="6"/>
+        </w:numPr>
+      </w:pPr>
+      <w:r>
+        <w:rPr>
+          <w:b/>
+          <w:bCs/>
+          <w:rtl/>
+        </w:rPr>
+        <w:t>סטטוס נוכחי ומשימות להמשך</w:t>
+      </w:r>
+      <w:r>
+        <w:rPr>
+          <w:b/>
+          <w:bCs/>
+        </w:rPr>
+        <w:t xml:space="preserve"> (Current Status &amp; Next Steps):</w:t>
+      </w:r>
+      <w:r>
+        <w:t xml:space="preserve"> </w:t>
+      </w:r>
+      <w:r>
+        <w:rPr>
+          <w:rtl/>
+        </w:rPr>
+        <w:t>חיבור קבצי שאלות דינמיים מתוך תיקיות התוכן בהתאם לנושא הנבחר על ידי המורה</w:t>
+      </w:r>
+      <w:r>
+        <w:t xml:space="preserve">. </w:t>
+      </w:r>
+    </w:p>
+    <w:p>
+      <w:pPr>
+        <w:rPr>
+          <w:rtl/>
+        </w:rPr>
+      </w:pPr>
+    </w:p>
+    <w:p>
+      <w:pPr>
+        <w:rPr>
+          <w:rFonts w:asciiTheme="minorBidi" w:hAnsiTheme="minorBidi"/>
+          <w:b/>
+          <w:bCs/>
+          <w:color w:val="EE0000"/>
+          <w:rtl/>
+        </w:rPr>
+      </w:pPr>
+      <w:r>
+        <w:rPr>
+          <w:rFonts w:asciiTheme="minorBidi" w:hAnsiTheme="minorBidi" w:hint="cs"/>
+          <w:b/>
+          <w:bCs/>
+          <w:color w:val="EE0000"/>
+          <w:rtl/>
+        </w:rPr>
+        <w:t>???</w:t>
+      </w:r>
+    </w:p>
+    <w:p>
+      <w:pPr>
+        <w:rPr>
+          <w:rtl/>
+        </w:rPr>
+      </w:pPr>
+      <w:r>
+        <w:rPr>
+          <w:rtl/>
+        </w:rPr>
+        <w:t xml:space="preserve">מכיוון שהבהרת עכשיו שהמטרה </w:t>
+      </w:r>
+      <w:r>
+        <w:rPr>
+          <w:b/>
+          <w:bCs/>
+          <w:rtl/>
+        </w:rPr>
+        <w:t>היחידה</w:t>
+      </w:r>
+      <w:r>
+        <w:rPr>
+          <w:rtl/>
+        </w:rPr>
+        <w:t xml:space="preserve"> שלך כעת היא </w:t>
+      </w:r>
+      <w:r>
+        <w:rPr>
+          <w:b/>
+          <w:bCs/>
+          <w:rtl/>
+        </w:rPr>
+        <w:t>פיתוח הקוד של המערכת</w:t>
+      </w:r>
+      <w:r>
+        <w:rPr>
+          <w:rtl/>
+        </w:rPr>
+        <w:t>, אפשר להתעלם לחלוטין מכל ששת השאלות/הסעיפים הללו ולהתרכז אך ורק בקוד עצמו.</w:t>
+      </w:r>
+    </w:p>
+    <w:p>
+      <w:pPr>
+        <w:rPr>
+          <w:rtl/>
+        </w:rPr>
+      </w:pPr>
+      <w:r>
+        <w:rPr>
+          <w:rtl/>
+        </w:rPr>
+        <w:t xml:space="preserve">לפי הקבצים וסיכום המצב הקיים בפרויקט: </w:t>
+      </w:r>
+    </w:p>
+    <w:p>
+      <w:pPr>
+        <w:numPr>
+          <w:ilvl w:val="0"/>
+          <w:numId w:val="7"/>
+        </w:numPr>
+        <w:rPr>
+          <w:rtl/>
+        </w:rPr>
+      </w:pPr>
+      <w:r>
+        <w:rPr>
+          <w:b/>
+          <w:bCs/>
+          <w:rtl/>
+        </w:rPr>
+        <w:t>מה הצעד הבא בקוד?</w:t>
+      </w:r>
+      <w:r>
+        <w:rPr>
+          <w:rtl/>
+        </w:rPr>
+        <w:t xml:space="preserve"> כרגע הרכיב </w:t>
+      </w:r>
+      <w:r>
+        <w:t>App.js</w:t>
+      </w:r>
+      <w:r>
+        <w:rPr>
+          <w:rtl/>
+        </w:rPr>
+        <w:t xml:space="preserve"> מדלג על מסך בחירת הנושאים (</w:t>
+      </w:r>
+      <w:r>
+        <w:t>Topics.js</w:t>
+      </w:r>
+      <w:r>
+        <w:rPr>
+          <w:rtl/>
+        </w:rPr>
+        <w:t>) ומעביר את המשתמש ישירות ממסך הכניסה (</w:t>
+      </w:r>
+      <w:r>
+        <w:t>Welcome.js</w:t>
+      </w:r>
+      <w:r>
+        <w:rPr>
+          <w:rtl/>
+        </w:rPr>
+        <w:t>) לשאלון (</w:t>
+      </w:r>
+      <w:r>
+        <w:t>Quiz.js</w:t>
+      </w:r>
+      <w:r>
+        <w:rPr>
+          <w:rtl/>
+        </w:rPr>
+        <w:t xml:space="preserve">). </w:t>
+      </w:r>
+    </w:p>
+    <w:p>
+      <w:pPr>
+        <w:numPr>
+          <w:ilvl w:val="0"/>
+          <w:numId w:val="7"/>
+        </w:numPr>
+        <w:rPr>
+          <w:rtl/>
+        </w:rPr>
+      </w:pPr>
+      <w:r>
+        <w:rPr>
+          <w:b/>
+          <w:bCs/>
+          <w:rtl/>
+        </w:rPr>
+        <w:t>מה צריך לעשות?</w:t>
+      </w:r>
+      <w:r>
+        <w:rPr>
+          <w:rtl/>
+        </w:rPr>
+        <w:t xml:space="preserve"> לחבר את </w:t>
+      </w:r>
+      <w:r>
+        <w:t>Topics.js</w:t>
+      </w:r>
+      <w:r>
+        <w:rPr>
+          <w:rtl/>
+        </w:rPr>
+        <w:t xml:space="preserve"> לתוך הנתב והמצב (</w:t>
+      </w:r>
+      <w:r>
+        <w:t>state</w:t>
+      </w:r>
+      <w:r>
+        <w:rPr>
+          <w:rtl/>
+        </w:rPr>
+        <w:t xml:space="preserve">) של </w:t>
+      </w:r>
+      <w:r>
+        <w:t>App.js</w:t>
+      </w:r>
+      <w:r>
+        <w:rPr>
+          <w:rtl/>
+        </w:rPr>
+        <w:t>, ולהגדיר שמקור הנתונים לשאלות יפעל לפי הנושא שהתלמיד או המורה בוחרים בסילבוס (</w:t>
+      </w:r>
+      <w:r>
+        <w:t>topics-config.js</w:t>
+      </w:r>
+      <w:r>
+        <w:rPr>
+          <w:rtl/>
+        </w:rPr>
+        <w:t xml:space="preserve">). </w:t>
+      </w:r>
+    </w:p>
+    <w:p>
+      <w:pPr>
+        <w:rPr>
+          <w:rtl/>
+        </w:rPr>
+      </w:pPr>
+      <w:r>
+        <w:rPr>
+          <w:rtl/>
+        </w:rPr>
+        <w:t xml:space="preserve">איך תרצי להמשיך? </w:t>
+      </w:r>
+      <w:r>
+        <w:rPr>
+          <w:bCs/>
+          <w:u w:val="single"/>
+          <w:rtl/>
+        </w:rPr>
+        <w:t xml:space="preserve">נוכל לעבור ישירות לכתיבת הקוד של </w:t>
+      </w:r>
+      <w:r>
+        <w:rPr>
+          <w:bCs/>
+          <w:u w:val="single"/>
+        </w:rPr>
+        <w:t>App.js</w:t>
+      </w:r>
+      <w:r>
+        <w:rPr>
+          <w:bCs/>
+          <w:u w:val="single"/>
+          <w:rtl/>
+        </w:rPr>
+        <w:t xml:space="preserve"> כדי לשלב את מסך הנושאים</w:t>
+      </w:r>
+      <w:r>
+        <w:rPr>
+          <w:rtl/>
+        </w:rPr>
+        <w:t>, או להשלים את הפרמטר של קובץ האקסל בניהול המורה.</w:t>
+      </w:r>
+    </w:p>
+    <w:p>
+      <w:r>
+        <w:rPr>
+          <w:rtl/>
+        </w:rPr>
+        <w:t xml:space="preserve">על מנת לשלב את </w:t>
+      </w:r>
+      <w:r>
+        <w:rPr>
+          <w:b/>
+          <w:bCs/>
+          <w:rtl/>
+        </w:rPr>
+        <w:t>מסך הנושאים</w:t>
+      </w:r>
+      <w:r>
+        <w:rPr>
+          <w:b/>
+          <w:bCs/>
+        </w:rPr>
+        <w:t xml:space="preserve"> (Topics.js)</w:t>
+      </w:r>
+      <w:r>
+        <w:t xml:space="preserve"> </w:t>
+      </w:r>
+      <w:r>
+        <w:rPr>
+          <w:rtl/>
+        </w:rPr>
+        <w:t xml:space="preserve">ואת </w:t>
+      </w:r>
+      <w:r>
+        <w:rPr>
+          <w:b/>
+          <w:bCs/>
+          <w:rtl/>
+        </w:rPr>
+        <w:t>ניהול המורה</w:t>
+      </w:r>
+      <w:r>
+        <w:rPr>
+          <w:b/>
+          <w:bCs/>
+        </w:rPr>
+        <w:t xml:space="preserve"> (TeacherPanel.js)</w:t>
+      </w:r>
+      <w:r>
+        <w:t xml:space="preserve">, </w:t>
+      </w:r>
+      <w:r>
+        <w:rPr>
+          <w:rtl/>
+        </w:rPr>
+        <w:t xml:space="preserve">ולהוסיף את </w:t>
+      </w:r>
+      <w:r>
+        <w:rPr>
+          <w:b/>
+          <w:bCs/>
+          <w:rtl/>
+        </w:rPr>
+        <w:t>שם קובץ האקסל (שם הגיליון) כפרמטר דינמי בקובץ הניהול של המורה</w:t>
+      </w:r>
+      <w:r>
+        <w:t xml:space="preserve">, </w:t>
+      </w:r>
+      <w:r>
+        <w:rPr>
+          <w:rtl/>
+        </w:rPr>
+        <w:t>להלן ההנחיות והקוד המלא</w:t>
+      </w:r>
+      <w:r>
+        <w:t>.</w:t>
+      </w:r>
+    </w:p>
+    <w:p>
+      <w:pPr>
+        <w:rPr>
+          <w:b/>
+          <w:bCs/>
+        </w:rPr>
+      </w:pPr>
+      <w:r>
+        <w:rPr>
+          <w:rFonts w:ascii="Segoe UI Emoji" w:hAnsi="Segoe UI Emoji" w:cs="Segoe UI Emoji"/>
+          <w:b/>
+          <w:bCs/>
+        </w:rPr>
+        <w:t>📍</w:t>
+      </w:r>
+      <w:r>
+        <w:rPr>
+          <w:b/>
+          <w:bCs/>
+        </w:rPr>
+        <w:t xml:space="preserve"> </w:t>
+      </w:r>
+      <w:r>
+        <w:rPr>
+          <w:b/>
+          <w:bCs/>
+          <w:rtl/>
+        </w:rPr>
+        <w:t>איפה מעדכנים ומה השינויים שנעשו</w:t>
+      </w:r>
+      <w:r>
+        <w:rPr>
+          <w:b/>
+          <w:bCs/>
+        </w:rPr>
+        <w:t>?</w:t>
+      </w:r>
+    </w:p>
+    <w:p>
+      <w:pPr>
+        <w:numPr>
+          <w:ilvl w:val="0"/>
+          <w:numId w:val="8"/>
+        </w:numPr>
+      </w:pPr>
+      <w:r>
+        <w:rPr>
+          <w:b/>
+          <w:bCs/>
+          <w:rtl/>
+        </w:rPr>
+        <w:t xml:space="preserve">קובץ הניהול </w:t>
+      </w:r>
+      <w:r>
+        <w:rPr>
+          <w:b/>
+          <w:bCs/>
+        </w:rPr>
+        <w:t xml:space="preserve">TeacherPanel.js </w:t>
+      </w:r>
+      <w:r>
+        <w:rPr>
+          <w:rFonts w:hint="cs"/>
+          <w:b/>
+          <w:bCs/>
+          <w:rtl/>
+        </w:rPr>
+        <w:t>(</w:t>
+      </w:r>
+      <w:r>
+        <w:rPr>
+          <w:b/>
+          <w:bCs/>
+          <w:rtl/>
+        </w:rPr>
+        <w:t>עדכון פרמטר קובץ האקסל</w:t>
+      </w:r>
+      <w:r>
+        <w:rPr>
+          <w:rFonts w:hint="cs"/>
+          <w:b/>
+          <w:bCs/>
+          <w:rtl/>
+        </w:rPr>
+        <w:t>)</w:t>
+      </w:r>
+      <w:r>
+        <w:t>:</w:t>
+      </w:r>
+    </w:p>
+    <w:p>
+      <w:pPr>
+        <w:numPr>
+          <w:ilvl w:val="1"/>
+          <w:numId w:val="8"/>
+        </w:numPr>
+      </w:pPr>
+      <w:r>
+        <w:rPr>
+          <w:b/>
+          <w:bCs/>
+          <w:rtl/>
+        </w:rPr>
+        <w:t>איפה הוספנו</w:t>
+      </w:r>
+      <w:r>
+        <w:rPr>
+          <w:b/>
+          <w:bCs/>
+        </w:rPr>
+        <w:t>?</w:t>
+      </w:r>
+      <w:r>
+        <w:t xml:space="preserve"> </w:t>
+      </w:r>
+      <w:r>
+        <w:rPr>
+          <w:rtl/>
+        </w:rPr>
+        <w:t>הוספנו שדה קלט</w:t>
+      </w:r>
+      <w:r>
+        <w:t xml:space="preserve"> (input) </w:t>
+      </w:r>
+      <w:r>
+        <w:rPr>
+          <w:rtl/>
+        </w:rPr>
+        <w:t xml:space="preserve">חדש בלוח הבקרה של המורה לקביעת </w:t>
+      </w:r>
+      <w:r>
+        <w:rPr>
+          <w:b/>
+          <w:bCs/>
+          <w:rtl/>
+        </w:rPr>
+        <w:t>שם הגיליון/קובץ האקסל ב</w:t>
+      </w:r>
+      <w:r>
+        <w:rPr>
+          <w:b/>
+          <w:bCs/>
+        </w:rPr>
+        <w:t>-Google Sheets</w:t>
+      </w:r>
+      <w:r>
+        <w:t xml:space="preserve">. </w:t>
+      </w:r>
+    </w:p>
+    <w:p>
+      <w:pPr>
+        <w:numPr>
+          <w:ilvl w:val="1"/>
+          <w:numId w:val="8"/>
+        </w:numPr>
+      </w:pPr>
+      <w:r>
+        <w:rPr>
+          <w:b/>
+          <w:bCs/>
+          <w:rtl/>
+        </w:rPr>
+        <w:t>איך זה עובד</w:t>
+      </w:r>
+      <w:r>
+        <w:rPr>
+          <w:b/>
+          <w:bCs/>
+        </w:rPr>
+        <w:t>?</w:t>
+      </w:r>
+      <w:r>
+        <w:t xml:space="preserve"> </w:t>
+      </w:r>
+      <w:r>
+        <w:rPr>
+          <w:rtl/>
+        </w:rPr>
+        <w:t>הגיליון נשמר ב</w:t>
+      </w:r>
+      <w:r>
+        <w:t>-</w:t>
+      </w:r>
+      <w:proofErr w:type="spellStart"/>
+      <w:r>
+        <w:t>localStorage</w:t>
+      </w:r>
+      <w:proofErr w:type="spellEnd"/>
+      <w:r>
+        <w:t xml:space="preserve"> </w:t>
+      </w:r>
+      <w:r>
+        <w:rPr>
+          <w:rtl/>
+        </w:rPr>
+        <w:t>תחת ה</w:t>
+      </w:r>
+      <w:r>
+        <w:t xml:space="preserve">-key EXCEL_SHEET_NAME </w:t>
+      </w:r>
+      <w:r>
+        <w:rPr>
+          <w:rtl/>
+        </w:rPr>
+        <w:t>ומשתמש ב</w:t>
+      </w:r>
+      <w:r>
+        <w:t xml:space="preserve">-CONFIG.SHEET_NAME </w:t>
+      </w:r>
+      <w:r>
+        <w:rPr>
+          <w:rtl/>
+        </w:rPr>
+        <w:t>כברירת מחדל</w:t>
+      </w:r>
+      <w:r>
+        <w:t xml:space="preserve">. </w:t>
+      </w:r>
+    </w:p>
+    <w:p>
+      <w:pPr>
+        <w:numPr>
+          <w:ilvl w:val="0"/>
+          <w:numId w:val="8"/>
+        </w:numPr>
+      </w:pPr>
+      <w:r>
+        <w:rPr>
+          <w:b/>
+          <w:bCs/>
+          <w:rtl/>
+        </w:rPr>
+        <w:t>קובץ ה</w:t>
+      </w:r>
+      <w:r>
+        <w:rPr>
+          <w:b/>
+          <w:bCs/>
+        </w:rPr>
+        <w:t xml:space="preserve">-App.js </w:t>
+      </w:r>
+      <w:r>
+        <w:rPr>
+          <w:rFonts w:hint="cs"/>
+          <w:b/>
+          <w:bCs/>
+          <w:rtl/>
+        </w:rPr>
+        <w:t>(</w:t>
+      </w:r>
+      <w:r>
+        <w:rPr>
+          <w:b/>
+          <w:bCs/>
+          <w:rtl/>
+        </w:rPr>
+        <w:t>שילוב מסך</w:t>
+      </w:r>
+      <w:r>
+        <w:rPr>
+          <w:b/>
+          <w:bCs/>
+        </w:rPr>
+        <w:t xml:space="preserve"> Topics </w:t>
+      </w:r>
+      <w:r>
+        <w:rPr>
+          <w:b/>
+          <w:bCs/>
+          <w:rtl/>
+        </w:rPr>
+        <w:t>והזרמת פרמטר האקסל</w:t>
+      </w:r>
+      <w:r>
+        <w:rPr>
+          <w:rFonts w:hint="cs"/>
+          <w:b/>
+          <w:bCs/>
+          <w:rtl/>
+        </w:rPr>
+        <w:t>)</w:t>
+      </w:r>
+      <w:r>
+        <w:t>:</w:t>
+      </w:r>
+    </w:p>
+    <w:p>
+      <w:pPr>
+        <w:numPr>
+          <w:ilvl w:val="1"/>
+          <w:numId w:val="8"/>
+        </w:numPr>
+      </w:pPr>
+      <w:r>
+        <w:rPr>
+          <w:b/>
+          <w:bCs/>
+          <w:rtl/>
+        </w:rPr>
+        <w:t>רכיבים שנלקחים דינמית</w:t>
+      </w:r>
+      <w:r>
+        <w:t xml:space="preserve">: </w:t>
+      </w:r>
+      <w:r>
+        <w:rPr>
+          <w:rtl/>
+        </w:rPr>
+        <w:t xml:space="preserve">הוספנו את </w:t>
+      </w:r>
+      <w:proofErr w:type="spellStart"/>
+      <w:r>
+        <w:t>TopicsComp</w:t>
+      </w:r>
+      <w:proofErr w:type="spellEnd"/>
+      <w:r>
+        <w:t xml:space="preserve"> </w:t>
+      </w:r>
+      <w:r>
+        <w:rPr>
+          <w:rtl/>
+        </w:rPr>
+        <w:t>ו</w:t>
+      </w:r>
+      <w:r>
+        <w:t>-</w:t>
+      </w:r>
+      <w:proofErr w:type="spellStart"/>
+      <w:r>
+        <w:t>TeacherPanelComp</w:t>
+      </w:r>
+      <w:proofErr w:type="spellEnd"/>
+      <w:r>
+        <w:t xml:space="preserve"> </w:t>
+      </w:r>
+      <w:r>
+        <w:rPr>
+          <w:rtl/>
+        </w:rPr>
+        <w:t>מטעינת ה</w:t>
+      </w:r>
+      <w:r>
+        <w:t xml:space="preserve">-window. </w:t>
+      </w:r>
+    </w:p>
+    <w:p>
+      <w:pPr>
+        <w:numPr>
+          <w:ilvl w:val="1"/>
+          <w:numId w:val="8"/>
+        </w:numPr>
+      </w:pPr>
+      <w:r>
+        <w:rPr>
+          <w:b/>
+          <w:bCs/>
+          <w:rtl/>
+        </w:rPr>
+        <w:t>ניהול מצבי מסך</w:t>
+      </w:r>
+      <w:r>
+        <w:rPr>
+          <w:b/>
+          <w:bCs/>
+        </w:rPr>
+        <w:t xml:space="preserve"> (Steps)</w:t>
+      </w:r>
+      <w:r>
+        <w:t>:</w:t>
+      </w:r>
+    </w:p>
+    <w:p>
+      <w:pPr>
+        <w:numPr>
+          <w:ilvl w:val="2"/>
+          <w:numId w:val="8"/>
+        </w:numPr>
+      </w:pPr>
+      <w:r>
+        <w:lastRenderedPageBreak/>
+        <w:t xml:space="preserve">'welcome' – </w:t>
+      </w:r>
+      <w:r>
+        <w:rPr>
+          <w:rtl/>
+        </w:rPr>
+        <w:t>מסך הכניסה/הרשמה</w:t>
+      </w:r>
+      <w:r>
+        <w:t xml:space="preserve">. </w:t>
+      </w:r>
+    </w:p>
+    <w:p>
+      <w:pPr>
+        <w:numPr>
+          <w:ilvl w:val="2"/>
+          <w:numId w:val="8"/>
+        </w:numPr>
+      </w:pPr>
+      <w:r>
+        <w:t xml:space="preserve">'topics' – </w:t>
+      </w:r>
+      <w:r>
+        <w:rPr>
+          <w:b/>
+          <w:bCs/>
+          <w:rtl/>
+        </w:rPr>
+        <w:t>מסך בחירת הנושאים (חדש!)</w:t>
+      </w:r>
+      <w:r>
+        <w:t xml:space="preserve">. </w:t>
+      </w:r>
+    </w:p>
+    <w:p>
+      <w:pPr>
+        <w:numPr>
+          <w:ilvl w:val="2"/>
+          <w:numId w:val="8"/>
+        </w:numPr>
+      </w:pPr>
+      <w:r>
+        <w:t xml:space="preserve">'quiz' – </w:t>
+      </w:r>
+      <w:r>
+        <w:rPr>
+          <w:rtl/>
+        </w:rPr>
+        <w:t>מסך השאלון</w:t>
+      </w:r>
+      <w:r>
+        <w:t xml:space="preserve">. </w:t>
+      </w:r>
+    </w:p>
+    <w:p>
+      <w:pPr>
+        <w:numPr>
+          <w:ilvl w:val="2"/>
+          <w:numId w:val="8"/>
+        </w:numPr>
+      </w:pPr>
+      <w:r>
+        <w:t xml:space="preserve">'summary' – </w:t>
+      </w:r>
+      <w:r>
+        <w:rPr>
+          <w:rtl/>
+        </w:rPr>
+        <w:t>מסך התוצאות</w:t>
+      </w:r>
+      <w:r>
+        <w:t xml:space="preserve">. </w:t>
+      </w:r>
+    </w:p>
+    <w:p>
+      <w:pPr>
+        <w:numPr>
+          <w:ilvl w:val="2"/>
+          <w:numId w:val="8"/>
+        </w:numPr>
+      </w:pPr>
+      <w:r>
+        <w:t xml:space="preserve">'teacher' – </w:t>
+      </w:r>
+      <w:r>
+        <w:rPr>
+          <w:rtl/>
+        </w:rPr>
+        <w:t>מסך ניהול המורה</w:t>
+      </w:r>
+      <w:r>
+        <w:t xml:space="preserve">. </w:t>
+      </w:r>
+    </w:p>
+    <w:p>
+      <w:pPr>
+        <w:numPr>
+          <w:ilvl w:val="1"/>
+          <w:numId w:val="8"/>
+        </w:numPr>
+      </w:pPr>
+      <w:r>
+        <w:rPr>
+          <w:b/>
+          <w:bCs/>
+          <w:rtl/>
+        </w:rPr>
+        <w:t xml:space="preserve">שליחת הנתונים לגוגל </w:t>
+      </w:r>
+      <w:proofErr w:type="spellStart"/>
+      <w:r>
+        <w:rPr>
+          <w:b/>
+          <w:bCs/>
+          <w:rtl/>
+        </w:rPr>
+        <w:t>שיטס</w:t>
+      </w:r>
+      <w:proofErr w:type="spellEnd"/>
+      <w:r>
+        <w:rPr>
+          <w:b/>
+          <w:bCs/>
+        </w:rPr>
+        <w:t xml:space="preserve"> (</w:t>
+      </w:r>
+      <w:proofErr w:type="spellStart"/>
+      <w:r>
+        <w:rPr>
+          <w:b/>
+          <w:bCs/>
+        </w:rPr>
+        <w:t>sendToSheets</w:t>
+      </w:r>
+      <w:proofErr w:type="spellEnd"/>
+      <w:r>
+        <w:rPr>
+          <w:b/>
+          <w:bCs/>
+        </w:rPr>
+        <w:t>)</w:t>
+      </w:r>
+      <w:r>
+        <w:t xml:space="preserve">: </w:t>
+      </w:r>
+      <w:r>
+        <w:rPr>
+          <w:rtl/>
+        </w:rPr>
+        <w:t>מעכשיו הפונקציה קוראת את שם קובץ/גיליון האקסל מתוך ה</w:t>
+      </w:r>
+      <w:r>
+        <w:t>-</w:t>
+      </w:r>
+      <w:proofErr w:type="spellStart"/>
+      <w:r>
+        <w:t>localStorage</w:t>
+      </w:r>
+      <w:proofErr w:type="spellEnd"/>
+      <w:r>
+        <w:t xml:space="preserve"> </w:t>
+      </w:r>
+      <w:r>
+        <w:rPr>
+          <w:rtl/>
+        </w:rPr>
+        <w:t>שהמורה הגדיר בלוח הניהול, ורק אם אינו קיים היא משתמשת בברירת המחדל מ</w:t>
+      </w:r>
+      <w:r>
+        <w:t xml:space="preserve">-CONFIG.SHEET_NAME. </w:t>
+      </w:r>
+    </w:p>
+    <w:p>
+      <w:pPr>
+        <w:rPr>
+          <w:rtl/>
+        </w:rPr>
+      </w:pPr>
+    </w:p>
+    <w:p>
+      <w:pPr>
+        <w:rPr>
+          <w:rFonts w:asciiTheme="minorBidi" w:hAnsiTheme="minorBidi"/>
+          <w:b/>
+          <w:bCs/>
+          <w:color w:val="EE0000"/>
+          <w:rtl/>
+        </w:rPr>
+      </w:pPr>
+      <w:r>
+        <w:rPr>
+          <w:rFonts w:asciiTheme="minorBidi" w:hAnsiTheme="minorBidi" w:hint="cs"/>
+          <w:b/>
+          <w:bCs/>
+          <w:color w:val="EE0000"/>
+          <w:rtl/>
+        </w:rPr>
+        <w:t>???</w:t>
+      </w:r>
+    </w:p>
+    <w:p>
+      <w:pPr>
+        <w:rPr>
+          <w:rFonts w:asciiTheme="minorBidi" w:hAnsiTheme="minorBidi"/>
+          <w:b/>
+          <w:bCs/>
+          <w:color w:val="EE0000"/>
+          <w:rtl/>
+        </w:rPr>
+      </w:pPr>
+      <w:r>
+        <w:rPr>
+          <w:rFonts w:asciiTheme="minorBidi" w:hAnsiTheme="minorBidi" w:hint="cs"/>
+          <w:b/>
+          <w:bCs/>
+          <w:color w:val="EE0000"/>
+          <w:rtl/>
+        </w:rPr>
+        <w:t>???</w:t>
+      </w:r>
+    </w:p>
+    <w:p>
+      <w:pPr>
+        <w:rPr>
+          <w:rFonts w:asciiTheme="minorBidi" w:hAnsiTheme="minorBidi"/>
+          <w:b/>
+          <w:bCs/>
+          <w:color w:val="EE0000"/>
+        </w:rPr>
+      </w:pPr>
+      <w:r>
+        <w:rPr>
+          <w:rFonts w:asciiTheme="minorBidi" w:hAnsiTheme="minorBidi" w:hint="cs"/>
+          <w:b/>
+          <w:bCs/>
+          <w:color w:val="EE0000"/>
+          <w:rtl/>
+        </w:rPr>
+        <w:t>???</w:t>
+      </w:r>
+    </w:p>
+    <w:p>
+      <w:pPr>
+        <w:rPr>
+          <w:rFonts w:asciiTheme="minorBidi" w:hAnsiTheme="minorBidi"/>
+          <w:b/>
+          <w:bCs/>
+          <w:color w:val="EE0000"/>
+          <w:rtl/>
+        </w:rPr>
+      </w:pPr>
+      <w:r>
+        <w:rPr>
+          <w:rFonts w:asciiTheme="minorBidi" w:hAnsiTheme="minorBidi" w:hint="cs"/>
+          <w:b/>
+          <w:bCs/>
+          <w:color w:val="EE0000"/>
+          <w:rtl/>
+        </w:rPr>
+        <w:t>???</w:t>
+      </w:r>
+    </w:p>
+    <w:p>
+      <w:pPr>
+        <w:rPr>
+          <w:rFonts w:asciiTheme="minorBidi" w:hAnsiTheme="minorBidi"/>
+          <w:b/>
+          <w:bCs/>
+          <w:color w:val="EE0000"/>
+          <w:rtl/>
+        </w:rPr>
+      </w:pPr>
+      <w:r>
+        <w:rPr>
+          <w:rFonts w:asciiTheme="minorBidi" w:hAnsiTheme="minorBidi" w:hint="cs"/>
+          <w:b/>
+          <w:bCs/>
+          <w:color w:val="EE0000"/>
+          <w:rtl/>
+        </w:rPr>
+        <w:t>???</w:t>
+      </w:r>
+    </w:p>
+    <w:p>
+      <w:pPr>
+        <w:rPr>
+          <w:rFonts w:asciiTheme="minorBidi" w:hAnsiTheme="minorBidi"/>
+          <w:b/>
+          <w:bCs/>
+          <w:color w:val="EE0000"/>
+        </w:rPr>
+      </w:pPr>
+      <w:r>
+        <w:rPr>
+          <w:rFonts w:asciiTheme="minorBidi" w:hAnsiTheme="minorBidi" w:hint="cs"/>
+          <w:b/>
+          <w:bCs/>
+          <w:color w:val="EE0000"/>
+          <w:rtl/>
+        </w:rPr>
+        <w:t>???</w:t>
+      </w:r>
+    </w:p>
+    <w:p>
+      <w:pPr>
+        <w:rPr>
+          <w:rFonts w:asciiTheme="minorBidi" w:hAnsiTheme="minorBidi"/>
+          <w:b/>
+          <w:bCs/>
+          <w:color w:val="EE0000"/>
+          <w:rtl/>
+        </w:rPr>
+      </w:pPr>
+      <w:r>
+        <w:rPr>
+          <w:rFonts w:asciiTheme="minorBidi" w:hAnsiTheme="minorBidi" w:hint="cs"/>
+          <w:b/>
+          <w:bCs/>
+          <w:color w:val="EE0000"/>
+          <w:rtl/>
+        </w:rPr>
+        <w:t>???</w:t>
+      </w:r>
+    </w:p>
+    <w:p>
+      <w:pPr>
+        <w:rPr>
+          <w:rFonts w:asciiTheme="minorBidi" w:hAnsiTheme="minorBidi"/>
+          <w:b/>
+          <w:bCs/>
+          <w:color w:val="EE0000"/>
+          <w:rtl/>
+        </w:rPr>
+      </w:pPr>
+      <w:r>
+        <w:rPr>
+          <w:rFonts w:asciiTheme="minorBidi" w:hAnsiTheme="minorBidi" w:hint="cs"/>
+          <w:b/>
+          <w:bCs/>
+          <w:color w:val="EE0000"/>
+          <w:rtl/>
+        </w:rPr>
+        <w:t>???</w:t>
+      </w:r>
+    </w:p>
+    <w:p>
+      <w:pPr>
+        <w:rPr>
+          <w:rFonts w:asciiTheme="minorBidi" w:hAnsiTheme="minorBidi"/>
+          <w:b/>
+          <w:bCs/>
+          <w:color w:val="EE0000"/>
+        </w:rPr>
+      </w:pPr>
+      <w:r>
+        <w:rPr>
+          <w:rFonts w:asciiTheme="minorBidi" w:hAnsiTheme="minorBidi" w:hint="cs"/>
+          <w:b/>
+          <w:bCs/>
+          <w:color w:val="EE0000"/>
+          <w:rtl/>
+        </w:rPr>
+        <w:t>???</w:t>
+      </w:r>
+    </w:p>
+    <w:p>
+      <w:pPr>
         <w:rPr>
           <w:rFonts w:hint="cs"/>
         </w:rPr>
@@ -2241,6 +3606,232 @@
     </w:lvl>
   </w:abstractNum>
   <w:abstractNum w:abstractNumId="1" w15:restartNumberingAfterBreak="0">
+    <w:nsid w:val="28F1538E"/>
+    <w:multiLevelType w:val="multilevel"/>
+    <w:tmpl w:val="7FEE515E"/>
+    <w:lvl w:ilvl="0">
+      <w:start w:val="1"/>
+      <w:numFmt w:val="decimal"/>
+      <w:lvlText w:val="%1."/>
+      <w:lvlJc w:val="left"/>
+      <w:pPr>
+        <w:tabs>
+          <w:tab w:val="num" w:pos="720"/>
+        </w:tabs>
+        <w:ind w:left="720" w:hanging="360"/>
+      </w:pPr>
+    </w:lvl>
+    <w:lvl w:ilvl="1" w:tentative="1">
+      <w:start w:val="1"/>
+      <w:numFmt w:val="decimal"/>
+      <w:lvlText w:val="%2."/>
+      <w:lvlJc w:val="left"/>
+      <w:pPr>
+        <w:tabs>
+          <w:tab w:val="num" w:pos="1440"/>
+        </w:tabs>
+        <w:ind w:left="1440" w:hanging="360"/>
+      </w:pPr>
+    </w:lvl>
+    <w:lvl w:ilvl="2" w:tentative="1">
+      <w:start w:val="1"/>
+      <w:numFmt w:val="decimal"/>
+      <w:lvlText w:val="%3."/>
+      <w:lvlJc w:val="left"/>
+      <w:pPr>
+        <w:tabs>
+          <w:tab w:val="num" w:pos="2160"/>
+        </w:tabs>
+        <w:ind w:left="2160" w:hanging="360"/>
+      </w:pPr>
+    </w:lvl>
+    <w:lvl w:ilvl="3" w:tentative="1">
+      <w:start w:val="1"/>
+      <w:numFmt w:val="decimal"/>
+      <w:lvlText w:val="%4."/>
+      <w:lvlJc w:val="left"/>
+      <w:pPr>
+        <w:tabs>
+          <w:tab w:val="num" w:pos="2880"/>
+        </w:tabs>
+        <w:ind w:left="2880" w:hanging="360"/>
+      </w:pPr>
+    </w:lvl>
+    <w:lvl w:ilvl="4" w:tentative="1">
+      <w:start w:val="1"/>
+      <w:numFmt w:val="decimal"/>
+      <w:lvlText w:val="%5."/>
+      <w:lvlJc w:val="left"/>
+      <w:pPr>
+        <w:tabs>
+          <w:tab w:val="num" w:pos="3600"/>
+        </w:tabs>
+        <w:ind w:left="3600" w:hanging="360"/>
+      </w:pPr>
+    </w:lvl>
+    <w:lvl w:ilvl="5" w:tentative="1">
+      <w:start w:val="1"/>
+      <w:numFmt w:val="decimal"/>
+      <w:lvlText w:val="%6."/>
+      <w:lvlJc w:val="left"/>
+      <w:pPr>
+        <w:tabs>
+          <w:tab w:val="num" w:pos="4320"/>
+        </w:tabs>
+        <w:ind w:left="4320" w:hanging="360"/>
+      </w:pPr>
+    </w:lvl>
+    <w:lvl w:ilvl="6" w:tentative="1">
+      <w:start w:val="1"/>
+      <w:numFmt w:val="decimal"/>
+      <w:lvlText w:val="%7."/>
+      <w:lvlJc w:val="left"/>
+      <w:pPr>
+        <w:tabs>
+          <w:tab w:val="num" w:pos="5040"/>
+        </w:tabs>
+        <w:ind w:left="5040" w:hanging="360"/>
+      </w:pPr>
+    </w:lvl>
+    <w:lvl w:ilvl="7" w:tentative="1">
+      <w:start w:val="1"/>
+      <w:numFmt w:val="decimal"/>
+      <w:lvlText w:val="%8."/>
+      <w:lvlJc w:val="left"/>
+      <w:pPr>
+        <w:tabs>
+          <w:tab w:val="num" w:pos="5760"/>
+        </w:tabs>
+        <w:ind w:left="5760" w:hanging="360"/>
+      </w:pPr>
+    </w:lvl>
+    <w:lvl w:ilvl="8" w:tentative="1">
+      <w:start w:val="1"/>
+      <w:numFmt w:val="decimal"/>
+      <w:lvlText w:val="%9."/>
+      <w:lvlJc w:val="left"/>
+      <w:pPr>
+        <w:tabs>
+          <w:tab w:val="num" w:pos="6480"/>
+        </w:tabs>
+        <w:ind w:left="6480" w:hanging="360"/>
+      </w:pPr>
+    </w:lvl>
+  </w:abstractNum>
+  <w:abstractNum w:abstractNumId="2" w15:restartNumberingAfterBreak="0">
+    <w:nsid w:val="32E81F47"/>
+    <w:multiLevelType w:val="multilevel"/>
+    <w:tmpl w:val="17B61258"/>
+    <w:lvl w:ilvl="0">
+      <w:start w:val="1"/>
+      <w:numFmt w:val="decimal"/>
+      <w:lvlText w:val="%1."/>
+      <w:lvlJc w:val="left"/>
+      <w:pPr>
+        <w:tabs>
+          <w:tab w:val="num" w:pos="720"/>
+        </w:tabs>
+        <w:ind w:left="720" w:hanging="360"/>
+      </w:pPr>
+    </w:lvl>
+    <w:lvl w:ilvl="1" w:tentative="1">
+      <w:start w:val="1"/>
+      <w:numFmt w:val="decimal"/>
+      <w:lvlText w:val="%2."/>
+      <w:lvlJc w:val="left"/>
+      <w:pPr>
+        <w:tabs>
+          <w:tab w:val="num" w:pos="1440"/>
+        </w:tabs>
+        <w:ind w:left="1440" w:hanging="360"/>
+      </w:pPr>
+    </w:lvl>
+    <w:lvl w:ilvl="2" w:tentative="1">
+      <w:start w:val="1"/>
+      <w:numFmt w:val="decimal"/>
+      <w:lvlText w:val="%3."/>
+      <w:lvlJc w:val="left"/>
+      <w:pPr>
+        <w:tabs>
+          <w:tab w:val="num" w:pos="2160"/>
+        </w:tabs>
+        <w:ind w:left="2160" w:hanging="360"/>
+      </w:pPr>
+    </w:lvl>
+    <w:lvl w:ilvl="3" w:tentative="1">
+      <w:start w:val="1"/>
+      <w:numFmt w:val="decimal"/>
+      <w:lvlText w:val="%4."/>
+      <w:lvlJc w:val="left"/>
+      <w:pPr>
+        <w:tabs>
+          <w:tab w:val="num" w:pos="2880"/>
+        </w:tabs>
+        <w:ind w:left="2880" w:hanging="360"/>
+      </w:pPr>
+    </w:lvl>
+    <w:lvl w:ilvl="4" w:tentative="1">
+      <w:start w:val="1"/>
+      <w:numFmt w:val="decimal"/>
+      <w:lvlText w:val="%5."/>
+      <w:lvlJc w:val="left"/>
+      <w:pPr>
+        <w:tabs>
+          <w:tab w:val="num" w:pos="3600"/>
+        </w:tabs>
+        <w:ind w:left="3600" w:hanging="360"/>
+      </w:pPr>
+    </w:lvl>
+    <w:lvl w:ilvl="5" w:tentative="1">
+      <w:start w:val="1"/>
+      <w:numFmt w:val="decimal"/>
+      <w:lvlText w:val="%6."/>
+      <w:lvlJc w:val="left"/>
+      <w:pPr>
+        <w:tabs>
+          <w:tab w:val="num" w:pos="4320"/>
+        </w:tabs>
+        <w:ind w:left="4320" w:hanging="360"/>
+      </w:pPr>
+    </w:lvl>
+    <w:lvl w:ilvl="6" w:tentative="1">
+      <w:start w:val="1"/>
+      <w:numFmt w:val="decimal"/>
+      <w:lvlText w:val="%7."/>
+      <w:lvlJc w:val="left"/>
+      <w:pPr>
+        <w:tabs>
+          <w:tab w:val="num" w:pos="5040"/>
+        </w:tabs>
+        <w:ind w:left="5040" w:hanging="360"/>
+      </w:pPr>
+    </w:lvl>
+    <w:lvl w:ilvl="7" w:tentative="1">
+      <w:start w:val="1"/>
+      <w:numFmt w:val="decimal"/>
+      <w:lvlText w:val="%8."/>
+      <w:lvlJc w:val="left"/>
+      <w:pPr>
+        <w:tabs>
+          <w:tab w:val="num" w:pos="5760"/>
+        </w:tabs>
+        <w:ind w:left="5760" w:hanging="360"/>
+      </w:pPr>
+    </w:lvl>
+    <w:lvl w:ilvl="8" w:tentative="1">
+      <w:start w:val="1"/>
+      <w:numFmt w:val="decimal"/>
+      <w:lvlText w:val="%9."/>
+      <w:lvlJc w:val="left"/>
+      <w:pPr>
+        <w:tabs>
+          <w:tab w:val="num" w:pos="6480"/>
+        </w:tabs>
+        <w:ind w:left="6480" w:hanging="360"/>
+      </w:pPr>
+    </w:lvl>
+  </w:abstractNum>
+  <w:abstractNum w:abstractNumId="3" w15:restartNumberingAfterBreak="0">
     <w:nsid w:val="53774E0E"/>
     <w:multiLevelType w:val="multilevel"/>
     <w:tmpl w:val="70D8ADFA"/>
@@ -2353,7 +3944,7 @@
       </w:pPr>
     </w:lvl>
   </w:abstractNum>
-  <w:abstractNum w:abstractNumId="2" w15:restartNumberingAfterBreak="0">
+  <w:abstractNum w:abstractNumId="4" w15:restartNumberingAfterBreak="0">
     <w:nsid w:val="5D9A159B"/>
     <w:multiLevelType w:val="multilevel"/>
     <w:tmpl w:val="2542DB5A"/>
@@ -2470,7 +4061,7 @@
       </w:pPr>
     </w:lvl>
   </w:abstractNum>
-  <w:abstractNum w:abstractNumId="3" w15:restartNumberingAfterBreak="0">
+  <w:abstractNum w:abstractNumId="5" w15:restartNumberingAfterBreak="0">
     <w:nsid w:val="5F0226F3"/>
     <w:multiLevelType w:val="multilevel"/>
     <w:tmpl w:val="D0FA975C"/>
@@ -2591,7 +4182,128 @@
       </w:pPr>
     </w:lvl>
   </w:abstractNum>
-  <w:abstractNum w:abstractNumId="4" w15:restartNumberingAfterBreak="0">
+  <w:abstractNum w:abstractNumId="6" w15:restartNumberingAfterBreak="0">
+    <w:nsid w:val="64CB10E7"/>
+    <w:multiLevelType w:val="multilevel"/>
+    <w:tmpl w:val="40B2435C"/>
+    <w:lvl w:ilvl="0">
+      <w:start w:val="1"/>
+      <w:numFmt w:val="decimal"/>
+      <w:lvlText w:val="%1."/>
+      <w:lvlJc w:val="left"/>
+      <w:pPr>
+        <w:tabs>
+          <w:tab w:val="num" w:pos="720"/>
+        </w:tabs>
+        <w:ind w:left="720" w:hanging="360"/>
+      </w:pPr>
+    </w:lvl>
+    <w:lvl w:ilvl="1">
+      <w:start w:val="1"/>
+      <w:numFmt w:val="bullet"/>
+      <w:lvlText w:val="o"/>
+      <w:lvlJc w:val="left"/>
+      <w:pPr>
+        <w:tabs>
+          <w:tab w:val="num" w:pos="1440"/>
+        </w:tabs>
+        <w:ind w:left="1440" w:hanging="360"/>
+      </w:pPr>
+      <w:rPr>
+        <w:rFonts w:ascii="Courier New" w:hAnsi="Courier New" w:hint="default"/>
+        <w:sz w:val="20"/>
+      </w:rPr>
+    </w:lvl>
+    <w:lvl w:ilvl="2">
+      <w:start w:val="1"/>
+      <w:numFmt w:val="bullet"/>
+      <w:lvlText w:val=""/>
+      <w:lvlJc w:val="left"/>
+      <w:pPr>
+        <w:tabs>
+          <w:tab w:val="num" w:pos="2160"/>
+        </w:tabs>
+        <w:ind w:left="2160" w:hanging="360"/>
+      </w:pPr>
+      <w:rPr>
+        <w:rFonts w:ascii="Wingdings" w:hAnsi="Wingdings" w:hint="default"/>
+        <w:sz w:val="20"/>
+      </w:rPr>
+    </w:lvl>
+    <w:lvl w:ilvl="3" w:tentative="1">
+      <w:start w:val="1"/>
+      <w:numFmt w:val="decimal"/>
+      <w:lvlText w:val="%4."/>
+      <w:lvlJc w:val="left"/>
+      <w:pPr>
+        <w:tabs>
+          <w:tab w:val="num" w:pos="2880"/>
+        </w:tabs>
+        <w:ind w:left="2880" w:hanging="360"/>
+      </w:pPr>
+    </w:lvl>
+    <w:lvl w:ilvl="4" w:tentative="1">
+      <w:start w:val="1"/>
+      <w:numFmt w:val="decimal"/>
+      <w:lvlText w:val="%5."/>
+      <w:lvlJc w:val="left"/>
+      <w:pPr>
+        <w:tabs>
+          <w:tab w:val="num" w:pos="3600"/>
+        </w:tabs>
+        <w:ind w:left="3600" w:hanging="360"/>
+      </w:pPr>
+    </w:lvl>
+    <w:lvl w:ilvl="5" w:tentative="1">
+      <w:start w:val="1"/>
+      <w:numFmt w:val="decimal"/>
+      <w:lvlText w:val="%6."/>
+      <w:lvlJc w:val="left"/>
+      <w:pPr>
+        <w:tabs>
+          <w:tab w:val="num" w:pos="4320"/>
+        </w:tabs>
+        <w:ind w:left="4320" w:hanging="360"/>
+      </w:pPr>
+    </w:lvl>
+    <w:lvl w:ilvl="6" w:tentative="1">
+      <w:start w:val="1"/>
+      <w:numFmt w:val="decimal"/>
+      <w:lvlText w:val="%7."/>
+      <w:lvlJc w:val="left"/>
+      <w:pPr>
+        <w:tabs>
+          <w:tab w:val="num" w:pos="5040"/>
+        </w:tabs>
+        <w:ind w:left="5040" w:hanging="360"/>
+      </w:pPr>
+    </w:lvl>
+    <w:lvl w:ilvl="7" w:tentative="1">
+      <w:start w:val="1"/>
+      <w:numFmt w:val="decimal"/>
+      <w:lvlText w:val="%8."/>
+      <w:lvlJc w:val="left"/>
+      <w:pPr>
+        <w:tabs>
+          <w:tab w:val="num" w:pos="5760"/>
+        </w:tabs>
+        <w:ind w:left="5760" w:hanging="360"/>
+      </w:pPr>
+    </w:lvl>
+    <w:lvl w:ilvl="8" w:tentative="1">
+      <w:start w:val="1"/>
+      <w:numFmt w:val="decimal"/>
+      <w:lvlText w:val="%9."/>
+      <w:lvlJc w:val="left"/>
+      <w:pPr>
+        <w:tabs>
+          <w:tab w:val="num" w:pos="6480"/>
+        </w:tabs>
+        <w:ind w:left="6480" w:hanging="360"/>
+      </w:pPr>
+    </w:lvl>
+  </w:abstractNum>
+  <w:abstractNum w:abstractNumId="7" w15:restartNumberingAfterBreak="0">
     <w:nsid w:val="77293C1C"/>
     <w:multiLevelType w:val="multilevel"/>
     <w:tmpl w:val="79426C62"/>
@@ -2709,19 +4421,28 @@
     </w:lvl>
   </w:abstractNum>
   <w:num w:numId="1" w16cid:durableId="1294486751">
-    <w:abstractNumId w:val="2"/>
+    <w:abstractNumId w:val="4"/>
   </w:num>
   <w:num w:numId="2" w16cid:durableId="481508081">
-    <w:abstractNumId w:val="3"/>
+    <w:abstractNumId w:val="5"/>
   </w:num>
   <w:num w:numId="3" w16cid:durableId="810446611">
     <w:abstractNumId w:val="0"/>
   </w:num>
   <w:num w:numId="4" w16cid:durableId="824783420">
-    <w:abstractNumId w:val="4"/>
+    <w:abstractNumId w:val="7"/>
   </w:num>
   <w:num w:numId="5" w16cid:durableId="1958758321">
+    <w:abstractNumId w:val="3"/>
+  </w:num>
+  <w:num w:numId="6" w16cid:durableId="144246057">
+    <w:abstractNumId w:val="2"/>
+  </w:num>
+  <w:num w:numId="7" w16cid:durableId="191457097">
     <w:abstractNumId w:val="1"/>
+  </w:num>
+  <w:num w:numId="8" w16cid:durableId="1078212969">
+    <w:abstractNumId w:val="6"/>
   </w:num>
 </w:numbering>
 </file>
@@ -3124,7 +4845,7 @@
   <w:style w:type="paragraph" w:default="1" w:styleId="Normal">
     <w:name w:val="Normal"/>
     <w:qFormat/>
-    <w:rsid w:val="00114CD0"/>
+    <w:rsid w:val="00705D2C"/>
     <w:pPr>
       <w:bidi/>
     </w:pPr>

</xml_diff>